<commit_message>
Curriculum enviado a Pilar y Jose Manuel
</commit_message>
<xml_diff>
--- a/WilliamHolt_Curriculum.docx
+++ b/WilliamHolt_Curriculum.docx
@@ -209,13 +209,16 @@
     <w:p>
       <w:pPr>
         <w:spacing w:after="50" w:before="50" w:lineRule="auto"/>
-        <w:rPr/>
-      </w:pPr>
-      <w:r>
-        <w:rPr>
-          <w:rFonts w:ascii="Arial" w:cs="Arial" w:eastAsia="Arial" w:hAnsi="Arial"/>
+        <w:rPr>
           <w:b w:val="1"/>
           <w:bCs w:val="1"/>
+        </w:rPr>
+      </w:pPr>
+      <w:r>
+        <w:rPr>
+          <w:rFonts w:ascii="Arial" w:cs="Arial" w:eastAsia="Arial" w:hAnsi="Arial"/>
+          <w:b w:val="1"/>
+          <w:bCs w:val="1"/>
           <w:sz w:val="20"/>
           <w:szCs w:val="20"/>
           <w:rtl w:val="0"/>
@@ -224,7 +227,8 @@
       </w:r>
       <w:r>
         <w:rPr>
-          <w:rFonts w:ascii="Arial" w:cs="Arial" w:eastAsia="Arial" w:hAnsi="Arial"/>
+          <w:b w:val="1"/>
+          <w:bCs w:val="1"/>
           <w:sz w:val="20"/>
           <w:szCs w:val="20"/>
           <w:rtl w:val="0"/>

</xml_diff>